<commit_message>
Document email agent cost reduction; replace Classifier+Critic wording
The first version of the Job Radar email agent checked each LLM
classification with a second LLM (Critic), which often looped several
times: about $1.00 and a few minutes per email. Sorting now uses a Jev
decision call, an LLM extracts posting links, and Python code validates
that output and retries if it isn't clean: about $0.04 and a few seconds
per email.

Record this in the knowledge base and update the resume bullet and
skills line everywhere they appear (site data, resume.txt, llms.txt,
docx). Regenerate the PDF via scripts/build-pdf.sh.

Co-Authored-By: Claude Opus 5.5 <noreply@anthropic.com>
</commit_message>
<xml_diff>
--- a/frontend/public/Duane_Pinkerton.docx
+++ b/frontend/public/Duane_Pinkerton.docx
@@ -281,7 +281,7 @@
         <w:rPr>
           <w:color w:val="444444"/>
         </w:rPr>
-        <w:t>System prompt design, context engineering, Classifier+Critic validation loops, evaluation</w:t>
+        <w:t>System prompt design, context engineering, code-based validation of LLM output, evaluation, LLM cost optimization</w:t>
       </w:r>
     </w:p>
     <w:p>
@@ -354,7 +354,7 @@
         <w:t xml:space="preserve">Built and deployed an agentic email pipeline: </w:t>
       </w:r>
       <w:r>
-        <w:t>a LangGraph agent that classifies job emails, pulls structured data out of them through a Classifier+Critic validation loop, and hands genuinely ambiguous cases to a human over Slack. Langfuse for observability, MCP servers on both ends. Wrote the threat model before any code, then built against it: prompt injection, stored XSS, and cross-tenant access each have a specific mitigation</w:t>
+        <w:t>a LangGraph agent that sorts job emails with a decision model, extracts posting links with an LLM whose output is validated in code, and hands genuinely ambiguous cases to a human over Slack. Replacing the original design, where an LLM checked another LLM, cut cost per email from about $1.00 to $0.04 and processing time from minutes to seconds. Langfuse for observability, MCP servers on both ends. Wrote the threat model before any code, then built against it: prompt injection, stored XSS, and cross-tenant access each have a specific mitigation</w:t>
       </w:r>
     </w:p>
     <w:p>

</xml_diff>